<commit_message>
docs: add new Pi getting started guide section
</commit_message>
<xml_diff>
--- a/docs/publications/N0JCG_Air_Traffic_Center_User_Guide_v1.1.docx
+++ b/docs/publications/N0JCG_Air_Traffic_Center_User_Guide_v1.1.docx
@@ -120,7 +120,7 @@
           <w:color w:val="5D6875"/>
           <w:sz w:val="18"/>
         </w:rPr>
-        <w:t>Version 1.1.1  |  Status: Current release  |  Owner: N0JCG Open Radio Platform  |  August 10, 2026</w:t>
+        <w:t>Version 1.1.1  |  Status: Current release  |  Owner: N0JCG Open Radio Platform  |  August 12, 2026</w:t>
       </w:r>
     </w:p>
     <w:p>
@@ -630,7 +630,7 @@
         <w:spacing w:after="60"/>
       </w:pPr>
       <w:r>
-        <w:t>2. Before you begin</w:t>
+        <w:t>2. Getting started with a new Pi</w:t>
       </w:r>
     </w:p>
     <w:p>
@@ -639,7 +639,7 @@
         <w:spacing w:after="60"/>
       </w:pPr>
       <w:r>
-        <w:t>3. Open and validate the app</w:t>
+        <w:t>3. Before you begin</w:t>
       </w:r>
     </w:p>
     <w:p>
@@ -648,7 +648,7 @@
         <w:spacing w:after="60"/>
       </w:pPr>
       <w:r>
-        <w:t>4. Operate traffic and audio sources</w:t>
+        <w:t>4. Open and validate the app</w:t>
       </w:r>
     </w:p>
     <w:p>
@@ -657,7 +657,7 @@
         <w:spacing w:after="60"/>
       </w:pPr>
       <w:r>
-        <w:t>5. Registration and trial access</w:t>
+        <w:t>5. Operate traffic and audio sources</w:t>
       </w:r>
     </w:p>
     <w:p>
@@ -666,7 +666,7 @@
         <w:spacing w:after="60"/>
       </w:pPr>
       <w:r>
-        <w:t>6. Use the aircraft detail view</w:t>
+        <w:t>6. Registration and trial access</w:t>
       </w:r>
     </w:p>
     <w:p>
@@ -675,7 +675,7 @@
         <w:spacing w:after="60"/>
       </w:pPr>
       <w:r>
-        <w:t>7. Weather radar and map controls</w:t>
+        <w:t>7. Use the aircraft detail view</w:t>
       </w:r>
     </w:p>
     <w:p>
@@ -684,7 +684,7 @@
         <w:spacing w:after="60"/>
       </w:pPr>
       <w:r>
-        <w:t>8. Maintenance and recovery</w:t>
+        <w:t>8. Weather radar and map controls</w:t>
       </w:r>
     </w:p>
     <w:p>
@@ -693,7 +693,16 @@
         <w:spacing w:after="60"/>
       </w:pPr>
       <w:r>
-        <w:t>9. Operator checklist and limitations</w:t>
+        <w:t>9. Maintenance and recovery</w:t>
+      </w:r>
+    </w:p>
+    <w:p>
+      <w:pPr>
+        <w:pStyle w:val="ListBullet"/>
+        <w:spacing w:after="60"/>
+      </w:pPr>
+      <w:r>
+        <w:t>10. Operator checklist and limitations</w:t>
       </w:r>
     </w:p>
     <w:tbl>
@@ -1174,7 +1183,726 @@
         <w:pStyle w:val="Heading1"/>
       </w:pPr>
       <w:r>
-        <w:t>2. Before you begin</w:t>
+        <w:t>2. Getting started with a new Pi</w:t>
+      </w:r>
+    </w:p>
+    <w:p>
+      <w:r>
+        <w:t>Use this section when preparing a new standalone N0JCG Air Traffic Center installation. The guided installer handles the software sequence, but the operator must prepare the Pi, connect the correct receivers and antennas, and identify the FlyCatcher paths before serial programming.</w:t>
+      </w:r>
+    </w:p>
+    <w:p>
+      <w:pPr>
+        <w:pStyle w:val="Heading2"/>
+      </w:pPr>
+      <w:r>
+        <w:t>Hardware checklist</w:t>
+      </w:r>
+    </w:p>
+    <w:tbl>
+      <w:tblPr>
+        <w:tblW w:type="auto" w:w="0"/>
+        <w:jc w:val="center"/>
+        <w:tblLayout w:type="fixed"/>
+        <w:tblLook w:firstColumn="1" w:firstRow="1" w:lastColumn="0" w:lastRow="0" w:noHBand="0" w:noVBand="1" w:val="04A0"/>
+      </w:tblPr>
+      <w:tblGrid>
+        <w:gridCol w:w="4680"/>
+        <w:gridCol w:w="4680"/>
+      </w:tblGrid>
+      <w:tr>
+        <w:tc>
+          <w:tcPr>
+            <w:tcW w:type="dxa" w:w="2232"/>
+            <w:shd w:fill="0A1F44"/>
+            <w:vAlign w:val="center"/>
+            <w:tcMar>
+              <w:top w:w="80" w:type="dxa"/>
+              <w:start w:w="120" w:type="dxa"/>
+              <w:bottom w:w="80" w:type="dxa"/>
+              <w:end w:w="120" w:type="dxa"/>
+            </w:tcMar>
+          </w:tcPr>
+          <w:p>
+            <w:pPr>
+              <w:spacing w:after="0"/>
+            </w:pPr>
+            <w:r/>
+            <w:r>
+              <w:rPr>
+                <w:rFonts w:ascii="Calibri" w:hAnsi="Calibri" w:eastAsia="Calibri"/>
+                <w:b/>
+                <w:color w:val="FFFFFF"/>
+                <w:sz w:val="18"/>
+              </w:rPr>
+              <w:t>Item</w:t>
+            </w:r>
+          </w:p>
+        </w:tc>
+        <w:tc>
+          <w:tcPr>
+            <w:tcW w:type="dxa" w:w="7128"/>
+            <w:shd w:fill="0A1F44"/>
+            <w:vAlign w:val="center"/>
+            <w:tcMar>
+              <w:top w:w="80" w:type="dxa"/>
+              <w:start w:w="120" w:type="dxa"/>
+              <w:bottom w:w="80" w:type="dxa"/>
+              <w:end w:w="120" w:type="dxa"/>
+            </w:tcMar>
+          </w:tcPr>
+          <w:p>
+            <w:pPr>
+              <w:spacing w:after="0"/>
+            </w:pPr>
+            <w:r/>
+            <w:r>
+              <w:rPr>
+                <w:rFonts w:ascii="Calibri" w:hAnsi="Calibri" w:eastAsia="Calibri"/>
+                <w:b/>
+                <w:color w:val="FFFFFF"/>
+                <w:sz w:val="18"/>
+              </w:rPr>
+              <w:t>Recommendation</w:t>
+            </w:r>
+          </w:p>
+        </w:tc>
+      </w:tr>
+      <w:tr>
+        <w:tc>
+          <w:tcPr>
+            <w:tcW w:type="dxa" w:w="2232"/>
+            <w:shd w:fill="E8EEF5"/>
+            <w:vAlign w:val="center"/>
+            <w:tcMar>
+              <w:top w:w="80" w:type="dxa"/>
+              <w:start w:w="120" w:type="dxa"/>
+              <w:bottom w:w="80" w:type="dxa"/>
+              <w:end w:w="120" w:type="dxa"/>
+            </w:tcMar>
+          </w:tcPr>
+          <w:p>
+            <w:pPr>
+              <w:spacing w:after="0"/>
+            </w:pPr>
+            <w:r/>
+            <w:r>
+              <w:rPr>
+                <w:rFonts w:ascii="Calibri" w:hAnsi="Calibri" w:eastAsia="Calibri"/>
+                <w:b w:val="0"/>
+                <w:color w:val="2B3440"/>
+                <w:sz w:val="18"/>
+              </w:rPr>
+              <w:t>Raspberry Pi</w:t>
+            </w:r>
+          </w:p>
+        </w:tc>
+        <w:tc>
+          <w:tcPr>
+            <w:tcW w:type="dxa" w:w="7128"/>
+            <w:shd w:fill="E8EEF5"/>
+            <w:vAlign w:val="center"/>
+            <w:tcMar>
+              <w:top w:w="80" w:type="dxa"/>
+              <w:start w:w="120" w:type="dxa"/>
+              <w:bottom w:w="80" w:type="dxa"/>
+              <w:end w:w="120" w:type="dxa"/>
+            </w:tcMar>
+          </w:tcPr>
+          <w:p>
+            <w:pPr>
+              <w:spacing w:after="0"/>
+            </w:pPr>
+            <w:r/>
+            <w:r>
+              <w:rPr>
+                <w:rFonts w:ascii="Calibri" w:hAnsi="Calibri" w:eastAsia="Calibri"/>
+                <w:b w:val="0"/>
+                <w:color w:val="2B3440"/>
+                <w:sz w:val="18"/>
+              </w:rPr>
+              <w:t>Raspberry Pi 5 with a reliable USB-C power supply and adequate cooling.</w:t>
+            </w:r>
+          </w:p>
+        </w:tc>
+      </w:tr>
+      <w:tr>
+        <w:tc>
+          <w:tcPr>
+            <w:tcW w:type="dxa" w:w="2232"/>
+            <w:shd w:fill="FFFFFF"/>
+            <w:vAlign w:val="center"/>
+            <w:tcMar>
+              <w:top w:w="80" w:type="dxa"/>
+              <w:start w:w="120" w:type="dxa"/>
+              <w:bottom w:w="80" w:type="dxa"/>
+              <w:end w:w="120" w:type="dxa"/>
+            </w:tcMar>
+          </w:tcPr>
+          <w:p>
+            <w:pPr>
+              <w:spacing w:after="0"/>
+            </w:pPr>
+            <w:r/>
+            <w:r>
+              <w:rPr>
+                <w:rFonts w:ascii="Calibri" w:hAnsi="Calibri" w:eastAsia="Calibri"/>
+                <w:b w:val="0"/>
+                <w:color w:val="2B3440"/>
+                <w:sz w:val="18"/>
+              </w:rPr>
+              <w:t>SD card</w:t>
+            </w:r>
+          </w:p>
+        </w:tc>
+        <w:tc>
+          <w:tcPr>
+            <w:tcW w:type="dxa" w:w="7128"/>
+            <w:shd w:fill="FFFFFF"/>
+            <w:vAlign w:val="center"/>
+            <w:tcMar>
+              <w:top w:w="80" w:type="dxa"/>
+              <w:start w:w="120" w:type="dxa"/>
+              <w:bottom w:w="80" w:type="dxa"/>
+              <w:end w:w="120" w:type="dxa"/>
+            </w:tcMar>
+          </w:tcPr>
+          <w:p>
+            <w:pPr>
+              <w:spacing w:after="0"/>
+            </w:pPr>
+            <w:r/>
+            <w:r>
+              <w:rPr>
+                <w:rFonts w:ascii="Calibri" w:hAnsi="Calibri" w:eastAsia="Calibri"/>
+                <w:b w:val="0"/>
+                <w:color w:val="2B3440"/>
+                <w:sz w:val="18"/>
+              </w:rPr>
+              <w:t>High-endurance 32 GB or larger card; use a quality card reader and verify the image before first boot.</w:t>
+            </w:r>
+          </w:p>
+        </w:tc>
+      </w:tr>
+      <w:tr>
+        <w:tc>
+          <w:tcPr>
+            <w:tcW w:type="dxa" w:w="2232"/>
+            <w:shd w:fill="E8EEF5"/>
+            <w:vAlign w:val="center"/>
+            <w:tcMar>
+              <w:top w:w="80" w:type="dxa"/>
+              <w:start w:w="120" w:type="dxa"/>
+              <w:bottom w:w="80" w:type="dxa"/>
+              <w:end w:w="120" w:type="dxa"/>
+            </w:tcMar>
+          </w:tcPr>
+          <w:p>
+            <w:pPr>
+              <w:spacing w:after="0"/>
+            </w:pPr>
+            <w:r/>
+            <w:r>
+              <w:rPr>
+                <w:rFonts w:ascii="Calibri" w:hAnsi="Calibri" w:eastAsia="Calibri"/>
+                <w:b w:val="0"/>
+                <w:color w:val="2B3440"/>
+                <w:sz w:val="18"/>
+              </w:rPr>
+              <w:t>Network</w:t>
+            </w:r>
+          </w:p>
+        </w:tc>
+        <w:tc>
+          <w:tcPr>
+            <w:tcW w:type="dxa" w:w="7128"/>
+            <w:shd w:fill="E8EEF5"/>
+            <w:vAlign w:val="center"/>
+            <w:tcMar>
+              <w:top w:w="80" w:type="dxa"/>
+              <w:start w:w="120" w:type="dxa"/>
+              <w:bottom w:w="80" w:type="dxa"/>
+              <w:end w:w="120" w:type="dxa"/>
+            </w:tcMar>
+          </w:tcPr>
+          <w:p>
+            <w:pPr>
+              <w:spacing w:after="0"/>
+            </w:pPr>
+            <w:r/>
+            <w:r>
+              <w:rPr>
+                <w:rFonts w:ascii="Calibri" w:hAnsi="Calibri" w:eastAsia="Calibri"/>
+                <w:b w:val="0"/>
+                <w:color w:val="2B3440"/>
+                <w:sz w:val="18"/>
+              </w:rPr>
+              <w:t>Ethernet is recommended for the initial setup and steady aircraft/audio operation. Wi-Fi can be used when Ethernet is unavailable.</w:t>
+            </w:r>
+          </w:p>
+        </w:tc>
+      </w:tr>
+      <w:tr>
+        <w:tc>
+          <w:tcPr>
+            <w:tcW w:type="dxa" w:w="2232"/>
+            <w:shd w:fill="FFFFFF"/>
+            <w:vAlign w:val="center"/>
+            <w:tcMar>
+              <w:top w:w="80" w:type="dxa"/>
+              <w:start w:w="120" w:type="dxa"/>
+              <w:bottom w:w="80" w:type="dxa"/>
+              <w:end w:w="120" w:type="dxa"/>
+            </w:tcMar>
+          </w:tcPr>
+          <w:p>
+            <w:pPr>
+              <w:spacing w:after="0"/>
+            </w:pPr>
+            <w:r/>
+            <w:r>
+              <w:rPr>
+                <w:rFonts w:ascii="Calibri" w:hAnsi="Calibri" w:eastAsia="Calibri"/>
+                <w:b w:val="0"/>
+                <w:color w:val="2B3440"/>
+                <w:sz w:val="18"/>
+              </w:rPr>
+              <w:t>ADS-B / UAT receiver</w:t>
+            </w:r>
+          </w:p>
+        </w:tc>
+        <w:tc>
+          <w:tcPr>
+            <w:tcW w:type="dxa" w:w="7128"/>
+            <w:shd w:fill="FFFFFF"/>
+            <w:vAlign w:val="center"/>
+            <w:tcMar>
+              <w:top w:w="80" w:type="dxa"/>
+              <w:start w:w="120" w:type="dxa"/>
+              <w:bottom w:w="80" w:type="dxa"/>
+              <w:end w:w="120" w:type="dxa"/>
+            </w:tcMar>
+          </w:tcPr>
+          <w:p>
+            <w:pPr>
+              <w:spacing w:after="0"/>
+            </w:pPr>
+            <w:r/>
+            <w:r>
+              <w:rPr>
+                <w:rFonts w:ascii="Calibri" w:hAnsi="Calibri" w:eastAsia="Calibri"/>
+                <w:b w:val="0"/>
+                <w:color w:val="2B3440"/>
+                <w:sz w:val="18"/>
+              </w:rPr>
+              <w:t>Nooelec FlyCatcher dual-tuner receiver with clearly identified ADS-B and UAT paths.</w:t>
+            </w:r>
+          </w:p>
+        </w:tc>
+      </w:tr>
+      <w:tr>
+        <w:tc>
+          <w:tcPr>
+            <w:tcW w:type="dxa" w:w="2232"/>
+            <w:shd w:fill="E8EEF5"/>
+            <w:vAlign w:val="center"/>
+            <w:tcMar>
+              <w:top w:w="80" w:type="dxa"/>
+              <w:start w:w="120" w:type="dxa"/>
+              <w:bottom w:w="80" w:type="dxa"/>
+              <w:end w:w="120" w:type="dxa"/>
+            </w:tcMar>
+          </w:tcPr>
+          <w:p>
+            <w:pPr>
+              <w:spacing w:after="0"/>
+            </w:pPr>
+            <w:r/>
+            <w:r>
+              <w:rPr>
+                <w:rFonts w:ascii="Calibri" w:hAnsi="Calibri" w:eastAsia="Calibri"/>
+                <w:b w:val="0"/>
+                <w:color w:val="2B3440"/>
+                <w:sz w:val="18"/>
+              </w:rPr>
+              <w:t>NOAA / Airband receiver</w:t>
+            </w:r>
+          </w:p>
+        </w:tc>
+        <w:tc>
+          <w:tcPr>
+            <w:tcW w:type="dxa" w:w="7128"/>
+            <w:shd w:fill="E8EEF5"/>
+            <w:vAlign w:val="center"/>
+            <w:tcMar>
+              <w:top w:w="80" w:type="dxa"/>
+              <w:start w:w="120" w:type="dxa"/>
+              <w:bottom w:w="80" w:type="dxa"/>
+              <w:end w:w="120" w:type="dxa"/>
+            </w:tcMar>
+          </w:tcPr>
+          <w:p>
+            <w:pPr>
+              <w:spacing w:after="0"/>
+            </w:pPr>
+            <w:r/>
+            <w:r>
+              <w:rPr>
+                <w:rFonts w:ascii="Calibri" w:hAnsi="Calibri" w:eastAsia="Calibri"/>
+                <w:b w:val="0"/>
+                <w:color w:val="2B3440"/>
+                <w:sz w:val="18"/>
+              </w:rPr>
+              <w:t>Nooelec NESDR Nano2+ for the shared 162 MHz NOAA and civil Airband path.</w:t>
+            </w:r>
+          </w:p>
+        </w:tc>
+      </w:tr>
+      <w:tr>
+        <w:tc>
+          <w:tcPr>
+            <w:tcW w:type="dxa" w:w="2232"/>
+            <w:shd w:fill="FFFFFF"/>
+            <w:vAlign w:val="center"/>
+            <w:tcMar>
+              <w:top w:w="80" w:type="dxa"/>
+              <w:start w:w="120" w:type="dxa"/>
+              <w:bottom w:w="80" w:type="dxa"/>
+              <w:end w:w="120" w:type="dxa"/>
+            </w:tcMar>
+          </w:tcPr>
+          <w:p>
+            <w:pPr>
+              <w:spacing w:after="0"/>
+            </w:pPr>
+            <w:r/>
+            <w:r>
+              <w:rPr>
+                <w:rFonts w:ascii="Calibri" w:hAnsi="Calibri" w:eastAsia="Calibri"/>
+                <w:b w:val="0"/>
+                <w:color w:val="2B3440"/>
+                <w:sz w:val="18"/>
+              </w:rPr>
+              <w:t>USB accessories</w:t>
+            </w:r>
+          </w:p>
+        </w:tc>
+        <w:tc>
+          <w:tcPr>
+            <w:tcW w:type="dxa" w:w="7128"/>
+            <w:shd w:fill="FFFFFF"/>
+            <w:vAlign w:val="center"/>
+            <w:tcMar>
+              <w:top w:w="80" w:type="dxa"/>
+              <w:start w:w="120" w:type="dxa"/>
+              <w:bottom w:w="80" w:type="dxa"/>
+              <w:end w:w="120" w:type="dxa"/>
+            </w:tcMar>
+          </w:tcPr>
+          <w:p>
+            <w:pPr>
+              <w:spacing w:after="0"/>
+            </w:pPr>
+            <w:r/>
+            <w:r>
+              <w:rPr>
+                <w:rFonts w:ascii="Calibri" w:hAnsi="Calibri" w:eastAsia="Calibri"/>
+                <w:b w:val="0"/>
+                <w:color w:val="2B3440"/>
+                <w:sz w:val="18"/>
+              </w:rPr>
+              <w:t>Powered USB hub if needed; keep the Pi power supply and receiver cabling physically secure.</w:t>
+            </w:r>
+          </w:p>
+        </w:tc>
+      </w:tr>
+    </w:tbl>
+    <w:p>
+      <w:pPr>
+        <w:pStyle w:val="Heading2"/>
+      </w:pPr>
+      <w:r>
+        <w:t>Recommended antennas</w:t>
+      </w:r>
+    </w:p>
+    <w:p>
+      <w:pPr>
+        <w:pStyle w:val="ListBullet"/>
+        <w:spacing w:after="60"/>
+      </w:pPr>
+      <w:r>
+        <w:t>1090 MHz: a dedicated outdoor or window-mounted ADS-B antenna with low-loss coax and a clear view of the sky.</w:t>
+      </w:r>
+    </w:p>
+    <w:p>
+      <w:pPr>
+        <w:pStyle w:val="ListBullet"/>
+        <w:spacing w:after="60"/>
+      </w:pPr>
+      <w:r>
+        <w:t>978 MHz: a band-appropriate antenna or the FlyCatcher antenna path intended for UAT reception.</w:t>
+      </w:r>
+    </w:p>
+    <w:p>
+      <w:pPr>
+        <w:pStyle w:val="ListBullet"/>
+        <w:spacing w:after="60"/>
+      </w:pPr>
+      <w:r>
+        <w:t>162 MHz NOAA / civil Airband: a VHF antenna covering approximately 118-163 MHz, connected to the NESDR Nano2+.</w:t>
+      </w:r>
+    </w:p>
+    <w:p>
+      <w:pPr>
+        <w:pStyle w:val="ListBullet"/>
+        <w:spacing w:after="60"/>
+      </w:pPr>
+      <w:r>
+        <w:t>Keep antenna cables short where practical and label each cable with its receiver role before connecting USB devices.</w:t>
+      </w:r>
+    </w:p>
+    <w:tbl>
+      <w:tblPr>
+        <w:tblW w:type="auto" w:w="0"/>
+        <w:jc w:val="center"/>
+        <w:tblLayout w:type="fixed"/>
+        <w:tblLook w:firstColumn="1" w:firstRow="1" w:lastColumn="0" w:lastRow="0" w:noHBand="0" w:noVBand="1" w:val="04A0"/>
+      </w:tblPr>
+      <w:tblGrid>
+        <w:gridCol w:w="9360"/>
+      </w:tblGrid>
+      <w:tr>
+        <w:tc>
+          <w:tcPr>
+            <w:tcW w:type="dxa" w:w="9360"/>
+            <w:shd w:fill="F4F7FA"/>
+            <w:tcMar>
+              <w:top w:w="120" w:type="dxa"/>
+              <w:start w:w="180" w:type="dxa"/>
+              <w:bottom w:w="120" w:type="dxa"/>
+              <w:end w:w="180" w:type="dxa"/>
+            </w:tcMar>
+          </w:tcPr>
+          <w:p>
+            <w:pPr>
+              <w:spacing w:after="0"/>
+            </w:pPr>
+            <w:r>
+              <w:rPr>
+                <w:rFonts w:ascii="Calibri" w:hAnsi="Calibri"/>
+                <w:b/>
+                <w:color w:val="C62828"/>
+                <w:sz w:val="18"/>
+              </w:rPr>
+              <w:t xml:space="preserve">RECEIVE-ONLY BOUNDARY  </w:t>
+            </w:r>
+            <w:r>
+              <w:rPr>
+                <w:rFonts w:ascii="Calibri" w:hAnsi="Calibri"/>
+                <w:color w:val="2B3440"/>
+                <w:sz w:val="19"/>
+              </w:rPr>
+              <w:t>This application only receives and displays aircraft and radio information. It does not transmit. Antenna placement, filtering, geography, and local RF conditions determine coverage and audio quality.</w:t>
+            </w:r>
+          </w:p>
+        </w:tc>
+      </w:tr>
+    </w:tbl>
+    <w:p>
+      <w:pPr>
+        <w:spacing w:after="20"/>
+      </w:pPr>
+    </w:p>
+    <w:p>
+      <w:pPr>
+        <w:pStyle w:val="Heading2"/>
+      </w:pPr>
+      <w:r>
+        <w:t>Prepare the Pi operating system</w:t>
+      </w:r>
+    </w:p>
+    <w:p>
+      <w:pPr>
+        <w:pStyle w:val="ListNumber"/>
+        <w:numPr>
+          <w:numId w:val="10"/>
+        </w:numPr>
+        <w:spacing w:after="60"/>
+      </w:pPr>
+      <w:r>
+        <w:t>Use Raspberry Pi Imager to write the current 64-bit Raspberry Pi OS/Debian-family image to the SD card. Choose a Lite image for a headless appliance or a Desktop image if the Pi will have a local display.</w:t>
+      </w:r>
+    </w:p>
+    <w:p>
+      <w:pPr>
+        <w:pStyle w:val="ListNumber"/>
+        <w:numPr>
+          <w:numId w:val="10"/>
+        </w:numPr>
+        <w:spacing w:after="60"/>
+      </w:pPr>
+      <w:r>
+        <w:t>In the Imager customization screen, set the hostname, create the Pi user, configure the network, set the time zone, and enable SSH using password authentication for the initial deployment.</w:t>
+      </w:r>
+    </w:p>
+    <w:p>
+      <w:pPr>
+        <w:pStyle w:val="ListNumber"/>
+        <w:numPr>
+          <w:numId w:val="10"/>
+        </w:numPr>
+        <w:spacing w:after="60"/>
+      </w:pPr>
+      <w:r>
+        <w:t>Insert the SD card, connect Ethernet and power, and allow the Pi to complete its first boot.</w:t>
+      </w:r>
+    </w:p>
+    <w:p>
+      <w:pPr>
+        <w:pStyle w:val="ListNumber"/>
+        <w:numPr>
+          <w:numId w:val="10"/>
+        </w:numPr>
+        <w:spacing w:after="60"/>
+      </w:pPr>
+      <w:r>
+        <w:t>From the workstation, confirm the Pi is reachable over SSH and keep all RTL-SDR receivers disconnected until the installer requests them.</w:t>
+      </w:r>
+    </w:p>
+    <w:p>
+      <w:pPr>
+        <w:pStyle w:val="Heading2"/>
+      </w:pPr>
+      <w:r>
+        <w:t>Run the guided first deployment</w:t>
+      </w:r>
+    </w:p>
+    <w:p>
+      <w:r>
+        <w:t>Run this from the MSYS2/UCRT64 terminal on the workstation containing the N0JCG Air Traffic Center repository:</w:t>
+      </w:r>
+    </w:p>
+    <w:p>
+      <w:pPr>
+        <w:spacing w:before="40" w:after="100" w:line="252" w:lineRule="auto"/>
+        <w:ind w:left="360" w:right="144"/>
+        <w:shd w:fill="EEF3F8"/>
+      </w:pPr>
+      <w:r>
+        <w:rPr>
+          <w:rFonts w:ascii="Consolas" w:hAnsi="Consolas" w:eastAsia="Consolas"/>
+          <w:color w:val="2B3440"/>
+          <w:sz w:val="17"/>
+        </w:rPr>
+        <w:t>./tools/install_pi_initial_deployment.sh</w:t>
+      </w:r>
+    </w:p>
+    <w:p>
+      <w:pPr>
+        <w:pStyle w:val="ListNumber"/>
+        <w:numPr>
+          <w:numId w:val="11"/>
+        </w:numPr>
+        <w:spacing w:after="60"/>
+      </w:pPr>
+      <w:r>
+        <w:t>Enter the Pi IP address, SSH user (normally pi), and SSH password. The launcher stores reusable values in a private local .env file.</w:t>
+      </w:r>
+    </w:p>
+    <w:p>
+      <w:pPr>
+        <w:pStyle w:val="ListNumber"/>
+        <w:numPr>
+          <w:numId w:val="11"/>
+        </w:numPr>
+        <w:spacing w:after="60"/>
+      </w:pPr>
+      <w:r>
+        <w:t>Follow the prompts to insert only the named radio. The installer backs up its EEPROM, assigns the correct serial automatically, asks you to remove it, and verifies it once before continuing.</w:t>
+      </w:r>
+    </w:p>
+    <w:p>
+      <w:pPr>
+        <w:pStyle w:val="ListNumber"/>
+        <w:numPr>
+          <w:numId w:val="11"/>
+        </w:numPr>
+        <w:spacing w:after="60"/>
+      </w:pPr>
+      <w:r>
+        <w:t>When prompted, reconnect all three receivers with their matching antennas. The installer validates the serial-to-role map before enabling the services.</w:t>
+      </w:r>
+    </w:p>
+    <w:p>
+      <w:pPr>
+        <w:pStyle w:val="ListNumber"/>
+        <w:numPr>
+          <w:numId w:val="11"/>
+        </w:numPr>
+        <w:spacing w:after="60"/>
+      </w:pPr>
+      <w:r>
+        <w:t>After service and API validation pass, open http://&lt;pi-ip-address&gt;:8090 in a browser on the same LAN.</w:t>
+      </w:r>
+    </w:p>
+    <w:tbl>
+      <w:tblPr>
+        <w:tblW w:type="auto" w:w="0"/>
+        <w:jc w:val="center"/>
+        <w:tblLayout w:type="fixed"/>
+        <w:tblLook w:firstColumn="1" w:firstRow="1" w:lastColumn="0" w:lastRow="0" w:noHBand="0" w:noVBand="1" w:val="04A0"/>
+      </w:tblPr>
+      <w:tblGrid>
+        <w:gridCol w:w="9360"/>
+      </w:tblGrid>
+      <w:tr>
+        <w:tc>
+          <w:tcPr>
+            <w:tcW w:type="dxa" w:w="9360"/>
+            <w:shd w:fill="F4F7FA"/>
+            <w:tcMar>
+              <w:top w:w="120" w:type="dxa"/>
+              <w:start w:w="180" w:type="dxa"/>
+              <w:bottom w:w="120" w:type="dxa"/>
+              <w:end w:w="180" w:type="dxa"/>
+            </w:tcMar>
+          </w:tcPr>
+          <w:p>
+            <w:pPr>
+              <w:spacing w:after="0"/>
+            </w:pPr>
+            <w:r>
+              <w:rPr>
+                <w:rFonts w:ascii="Calibri" w:hAnsi="Calibri"/>
+                <w:b/>
+                <w:color w:val="1565C0"/>
+                <w:sz w:val="18"/>
+              </w:rPr>
+              <w:t xml:space="preserve">REQUIRED SERIAL MAP  </w:t>
+            </w:r>
+            <w:r>
+              <w:rPr>
+                <w:rFonts w:ascii="Calibri" w:hAnsi="Calibri"/>
+                <w:color w:val="2B3440"/>
+                <w:sz w:val="19"/>
+              </w:rPr>
+              <w:t>ADS-B 1090 uses 00001090; NOAA/Airband uses 00000162; UAT 978 uses 00000978. The installer uses stable EEPROM serials rather than transient Linux USB indexes.</w:t>
+            </w:r>
+          </w:p>
+        </w:tc>
+      </w:tr>
+    </w:tbl>
+    <w:p>
+      <w:pPr>
+        <w:spacing w:after="20"/>
+      </w:pPr>
+    </w:p>
+    <w:p>
+      <w:pPr>
+        <w:pStyle w:val="Heading1"/>
+      </w:pPr>
+      <w:r>
+        <w:t>3. Before you begin</w:t>
       </w:r>
     </w:p>
     <w:p>
@@ -1640,7 +2368,7 @@
         <w:pStyle w:val="Heading1"/>
       </w:pPr>
       <w:r>
-        <w:t>3. Open and validate the app</w:t>
+        <w:t>4. Open and validate the app</w:t>
       </w:r>
     </w:p>
     <w:p>
@@ -1805,7 +2533,7 @@
         <w:pStyle w:val="Heading1"/>
       </w:pPr>
       <w:r>
-        <w:t>4. Operate traffic and audio sources</w:t>
+        <w:t>5. Operate traffic and audio sources</w:t>
       </w:r>
     </w:p>
     <w:p>
@@ -1892,7 +2620,7 @@
       <w:pPr>
         <w:pStyle w:val="ListNumber"/>
         <w:numPr>
-          <w:numId w:val="10"/>
+          <w:numId w:val="12"/>
         </w:numPr>
         <w:spacing w:after="60"/>
       </w:pPr>
@@ -1904,7 +2632,7 @@
       <w:pPr>
         <w:pStyle w:val="ListNumber"/>
         <w:numPr>
-          <w:numId w:val="10"/>
+          <w:numId w:val="12"/>
         </w:numPr>
         <w:spacing w:after="60"/>
       </w:pPr>
@@ -1916,7 +2644,7 @@
       <w:pPr>
         <w:pStyle w:val="ListNumber"/>
         <w:numPr>
-          <w:numId w:val="10"/>
+          <w:numId w:val="12"/>
         </w:numPr>
         <w:spacing w:after="60"/>
       </w:pPr>
@@ -1928,7 +2656,7 @@
       <w:pPr>
         <w:pStyle w:val="ListNumber"/>
         <w:numPr>
-          <w:numId w:val="10"/>
+          <w:numId w:val="12"/>
         </w:numPr>
         <w:spacing w:after="60"/>
       </w:pPr>
@@ -1948,7 +2676,7 @@
       <w:pPr>
         <w:pStyle w:val="ListNumber"/>
         <w:numPr>
-          <w:numId w:val="11"/>
+          <w:numId w:val="13"/>
         </w:numPr>
         <w:spacing w:after="60"/>
       </w:pPr>
@@ -1960,7 +2688,7 @@
       <w:pPr>
         <w:pStyle w:val="ListNumber"/>
         <w:numPr>
-          <w:numId w:val="11"/>
+          <w:numId w:val="13"/>
         </w:numPr>
         <w:spacing w:after="60"/>
       </w:pPr>
@@ -1972,7 +2700,7 @@
       <w:pPr>
         <w:pStyle w:val="ListNumber"/>
         <w:numPr>
-          <w:numId w:val="11"/>
+          <w:numId w:val="13"/>
         </w:numPr>
         <w:spacing w:after="60"/>
       </w:pPr>
@@ -2037,7 +2765,7 @@
         <w:pStyle w:val="Heading1"/>
       </w:pPr>
       <w:r>
-        <w:t>5. Registration and trial access</w:t>
+        <w:t>6. Registration and trial access</w:t>
       </w:r>
     </w:p>
     <w:p>
@@ -2057,7 +2785,7 @@
       <w:pPr>
         <w:pStyle w:val="ListNumber"/>
         <w:numPr>
-          <w:numId w:val="12"/>
+          <w:numId w:val="14"/>
         </w:numPr>
         <w:spacing w:after="60"/>
       </w:pPr>
@@ -2069,7 +2797,7 @@
       <w:pPr>
         <w:pStyle w:val="ListNumber"/>
         <w:numPr>
-          <w:numId w:val="12"/>
+          <w:numId w:val="14"/>
         </w:numPr>
         <w:spacing w:after="60"/>
       </w:pPr>
@@ -2081,7 +2809,7 @@
       <w:pPr>
         <w:pStyle w:val="ListNumber"/>
         <w:numPr>
-          <w:numId w:val="12"/>
+          <w:numId w:val="14"/>
         </w:numPr>
         <w:spacing w:after="60"/>
       </w:pPr>
@@ -2093,7 +2821,7 @@
       <w:pPr>
         <w:pStyle w:val="ListNumber"/>
         <w:numPr>
-          <w:numId w:val="12"/>
+          <w:numId w:val="14"/>
         </w:numPr>
         <w:spacing w:after="60"/>
       </w:pPr>
@@ -2193,7 +2921,7 @@
         <w:pStyle w:val="Heading1"/>
       </w:pPr>
       <w:r>
-        <w:t>6. Use the aircraft detail view</w:t>
+        <w:t>7. Use the aircraft detail view</w:t>
       </w:r>
     </w:p>
     <w:p>
@@ -2614,7 +3342,7 @@
         <w:pStyle w:val="Heading1"/>
       </w:pPr>
       <w:r>
-        <w:t>7. Weather radar and map controls</w:t>
+        <w:t>8. Weather radar and map controls</w:t>
       </w:r>
     </w:p>
     <w:p>
@@ -2715,7 +3443,7 @@
         <w:pStyle w:val="Heading1"/>
       </w:pPr>
       <w:r>
-        <w:t>8. Maintenance and recovery</w:t>
+        <w:t>9. Maintenance and recovery</w:t>
       </w:r>
     </w:p>
     <w:p>
@@ -3210,7 +3938,7 @@
       <w:pPr>
         <w:pStyle w:val="ListNumber"/>
         <w:numPr>
-          <w:numId w:val="13"/>
+          <w:numId w:val="15"/>
         </w:numPr>
         <w:spacing w:after="60"/>
       </w:pPr>
@@ -3222,7 +3950,7 @@
       <w:pPr>
         <w:pStyle w:val="ListNumber"/>
         <w:numPr>
-          <w:numId w:val="13"/>
+          <w:numId w:val="15"/>
         </w:numPr>
         <w:spacing w:after="60"/>
       </w:pPr>
@@ -3234,7 +3962,7 @@
       <w:pPr>
         <w:pStyle w:val="ListNumber"/>
         <w:numPr>
-          <w:numId w:val="13"/>
+          <w:numId w:val="15"/>
         </w:numPr>
         <w:spacing w:after="60"/>
       </w:pPr>
@@ -3246,7 +3974,7 @@
       <w:pPr>
         <w:pStyle w:val="ListNumber"/>
         <w:numPr>
-          <w:numId w:val="13"/>
+          <w:numId w:val="15"/>
         </w:numPr>
         <w:spacing w:after="60"/>
       </w:pPr>
@@ -3258,7 +3986,7 @@
       <w:pPr>
         <w:pStyle w:val="ListNumber"/>
         <w:numPr>
-          <w:numId w:val="13"/>
+          <w:numId w:val="15"/>
         </w:numPr>
         <w:spacing w:after="60"/>
       </w:pPr>
@@ -3271,7 +3999,7 @@
         <w:pStyle w:val="Heading1"/>
       </w:pPr>
       <w:r>
-        <w:t>9. Operator checklist and limitations</w:t>
+        <w:t>10. Operator checklist and limitations</w:t>
       </w:r>
     </w:p>
     <w:p>
@@ -4047,6 +4775,18 @@
       <w:startOverride w:val="1"/>
     </w:lvlOverride>
   </w:num>
+  <w:num w:numId="14">
+    <w:abstractNumId w:val="7"/>
+    <w:lvlOverride w:ilvl="0">
+      <w:startOverride w:val="1"/>
+    </w:lvlOverride>
+  </w:num>
+  <w:num w:numId="15">
+    <w:abstractNumId w:val="7"/>
+    <w:lvlOverride w:ilvl="0">
+      <w:startOverride w:val="1"/>
+    </w:lvlOverride>
+  </w:num>
 </w:numbering>
 </file>
 

</xml_diff>

<commit_message>
Add dedicated Airband receiver release v1.1.3
</commit_message>
<xml_diff>
--- a/docs/publications/N0JCG_Air_Traffic_Center_User_Guide_v1.1.docx
+++ b/docs/publications/N0JCG_Air_Traffic_Center_User_Guide_v1.1.docx
@@ -1525,7 +1525,7 @@
                 <w:color w:val="2B3440"/>
                 <w:sz w:val="18"/>
               </w:rPr>
-              <w:t>NOAA / Airband receiver</w:t>
+              <w:t>NOAA receiver</w:t>
             </w:r>
           </w:p>
         </w:tc>
@@ -1553,7 +1553,7 @@
                 <w:color w:val="2B3440"/>
                 <w:sz w:val="18"/>
               </w:rPr>
-              <w:t>Nooelec NESDR Nano2+ for the shared 162 MHz NOAA and civil Airband path.</w:t>
+              <w:t>Nooelec NESDR Nano2+ assigned to 00000162 for NOAA Weather Radio.</w:t>
             </w:r>
           </w:p>
         </w:tc>
@@ -1583,6 +1583,64 @@
                 <w:color w:val="2B3440"/>
                 <w:sz w:val="18"/>
               </w:rPr>
+              <w:t>Airband receiver</w:t>
+            </w:r>
+          </w:p>
+        </w:tc>
+        <w:tc>
+          <w:tcPr>
+            <w:tcW w:type="dxa" w:w="7128"/>
+            <w:shd w:fill="FFFFFF"/>
+            <w:vAlign w:val="center"/>
+            <w:tcMar>
+              <w:top w:w="80" w:type="dxa"/>
+              <w:start w:w="120" w:type="dxa"/>
+              <w:bottom w:w="80" w:type="dxa"/>
+              <w:end w:w="120" w:type="dxa"/>
+            </w:tcMar>
+          </w:tcPr>
+          <w:p>
+            <w:pPr>
+              <w:spacing w:after="0"/>
+            </w:pPr>
+            <w:r/>
+            <w:r>
+              <w:rPr>
+                <w:rFonts w:ascii="Calibri" w:hAnsi="Calibri" w:eastAsia="Calibri"/>
+                <w:b w:val="0"/>
+                <w:color w:val="2B3440"/>
+                <w:sz w:val="18"/>
+              </w:rPr>
+              <w:t>Dedicated RTL receiver assigned to 00000118 for civil Airband.</w:t>
+            </w:r>
+          </w:p>
+        </w:tc>
+      </w:tr>
+      <w:tr>
+        <w:tc>
+          <w:tcPr>
+            <w:tcW w:type="dxa" w:w="2232"/>
+            <w:shd w:fill="E8EEF5"/>
+            <w:vAlign w:val="center"/>
+            <w:tcMar>
+              <w:top w:w="80" w:type="dxa"/>
+              <w:start w:w="120" w:type="dxa"/>
+              <w:bottom w:w="80" w:type="dxa"/>
+              <w:end w:w="120" w:type="dxa"/>
+            </w:tcMar>
+          </w:tcPr>
+          <w:p>
+            <w:pPr>
+              <w:spacing w:after="0"/>
+            </w:pPr>
+            <w:r/>
+            <w:r>
+              <w:rPr>
+                <w:rFonts w:ascii="Calibri" w:hAnsi="Calibri" w:eastAsia="Calibri"/>
+                <w:b w:val="0"/>
+                <w:color w:val="2B3440"/>
+                <w:sz w:val="18"/>
+              </w:rPr>
               <w:t>USB accessories</w:t>
             </w:r>
           </w:p>
@@ -1590,7 +1648,7 @@
         <w:tc>
           <w:tcPr>
             <w:tcW w:type="dxa" w:w="7128"/>
-            <w:shd w:fill="FFFFFF"/>
+            <w:shd w:fill="E8EEF5"/>
             <w:vAlign w:val="center"/>
             <w:tcMar>
               <w:top w:w="80" w:type="dxa"/>
@@ -1649,7 +1707,16 @@
         <w:spacing w:after="60"/>
       </w:pPr>
       <w:r>
-        <w:t>162 MHz NOAA / civil Airband: a VHF antenna covering approximately 118-163 MHz, connected to the NESDR Nano2+.</w:t>
+        <w:t>162 MHz NOAA: a VHF antenna covering approximately 162 MHz, connected to the NESDR Nano2+.</w:t>
+      </w:r>
+    </w:p>
+    <w:p>
+      <w:pPr>
+        <w:pStyle w:val="ListBullet"/>
+        <w:spacing w:after="60"/>
+      </w:pPr>
+      <w:r>
+        <w:t>Civil Airband: a VHF antenna covering approximately 118-137 MHz, connected to the dedicated Airband receiver.</w:t>
       </w:r>
     </w:p>
     <w:p>
@@ -1830,7 +1897,7 @@
         <w:spacing w:after="60"/>
       </w:pPr>
       <w:r>
-        <w:t>When prompted, reconnect all three receivers with their matching antennas. The installer validates the serial-to-role map before enabling the services.</w:t>
+        <w:t>When prompted, reconnect all four receivers with their matching antennas. The installer validates the serial-to-role map before enabling the services.</w:t>
       </w:r>
     </w:p>
     <w:p>
@@ -1886,7 +1953,7 @@
                 <w:color w:val="2B3440"/>
                 <w:sz w:val="19"/>
               </w:rPr>
-              <w:t>ADS-B 1090 uses 00001090; NOAA/Airband uses 00000162; UAT 978 uses 00000978. The installer uses stable EEPROM serials rather than transient Linux USB indexes.</w:t>
+              <w:t>ADS-B 1090 uses 00001090; NOAA uses 00000162; dedicated Airband uses 00000118; UAT 978 uses 00000978. The installer uses stable EEPROM serials rather than transient Linux USB indexes.</w:t>
             </w:r>
           </w:p>
         </w:tc>
@@ -2033,7 +2100,7 @@
                 <w:color w:val="2B3440"/>
                 <w:sz w:val="18"/>
               </w:rPr>
-              <w:t>NOAA / Airband</w:t>
+              <w:t>NOAA Weather Radio</w:t>
             </w:r>
           </w:p>
         </w:tc>
@@ -2061,7 +2128,7 @@
                 <w:color w:val="2B3440"/>
                 <w:sz w:val="18"/>
               </w:rPr>
-              <w:t>Nooelec NESDR Nano2+; 162 MHz NFM and civil Airband AM</w:t>
+              <w:t>Nooelec NESDR Nano2+; 162 MHz NFM</w:t>
             </w:r>
           </w:p>
         </w:tc>
@@ -2119,7 +2186,7 @@
                 <w:color w:val="2B3440"/>
                 <w:sz w:val="18"/>
               </w:rPr>
-              <w:t>ADS-B 1090</w:t>
+              <w:t>Civil Airband</w:t>
             </w:r>
           </w:p>
         </w:tc>
@@ -2147,6 +2214,92 @@
                 <w:color w:val="2B3440"/>
                 <w:sz w:val="18"/>
               </w:rPr>
+              <w:t>Dedicated RTL receiver; civil Airband AM</w:t>
+            </w:r>
+          </w:p>
+        </w:tc>
+        <w:tc>
+          <w:tcPr>
+            <w:tcW w:type="dxa" w:w="1944"/>
+            <w:shd w:fill="FFFFFF"/>
+            <w:vAlign w:val="center"/>
+            <w:tcMar>
+              <w:top w:w="80" w:type="dxa"/>
+              <w:start w:w="120" w:type="dxa"/>
+              <w:bottom w:w="80" w:type="dxa"/>
+              <w:end w:w="120" w:type="dxa"/>
+            </w:tcMar>
+          </w:tcPr>
+          <w:p>
+            <w:pPr>
+              <w:spacing w:after="0"/>
+            </w:pPr>
+            <w:r/>
+            <w:r>
+              <w:rPr>
+                <w:rFonts w:ascii="Calibri" w:hAnsi="Calibri" w:eastAsia="Calibri"/>
+                <w:b w:val="0"/>
+                <w:color w:val="2B3440"/>
+                <w:sz w:val="18"/>
+              </w:rPr>
+              <w:t>00000118</w:t>
+            </w:r>
+          </w:p>
+        </w:tc>
+      </w:tr>
+      <w:tr>
+        <w:tc>
+          <w:tcPr>
+            <w:tcW w:type="dxa" w:w="1944"/>
+            <w:shd w:fill="E8EEF5"/>
+            <w:vAlign w:val="center"/>
+            <w:tcMar>
+              <w:top w:w="80" w:type="dxa"/>
+              <w:start w:w="120" w:type="dxa"/>
+              <w:bottom w:w="80" w:type="dxa"/>
+              <w:end w:w="120" w:type="dxa"/>
+            </w:tcMar>
+          </w:tcPr>
+          <w:p>
+            <w:pPr>
+              <w:spacing w:after="0"/>
+            </w:pPr>
+            <w:r/>
+            <w:r>
+              <w:rPr>
+                <w:rFonts w:ascii="Calibri" w:hAnsi="Calibri" w:eastAsia="Calibri"/>
+                <w:b w:val="0"/>
+                <w:color w:val="2B3440"/>
+                <w:sz w:val="18"/>
+              </w:rPr>
+              <w:t>ADS-B 1090</w:t>
+            </w:r>
+          </w:p>
+        </w:tc>
+        <w:tc>
+          <w:tcPr>
+            <w:tcW w:type="dxa" w:w="5472"/>
+            <w:shd w:fill="E8EEF5"/>
+            <w:vAlign w:val="center"/>
+            <w:tcMar>
+              <w:top w:w="80" w:type="dxa"/>
+              <w:start w:w="120" w:type="dxa"/>
+              <w:bottom w:w="80" w:type="dxa"/>
+              <w:end w:w="120" w:type="dxa"/>
+            </w:tcMar>
+          </w:tcPr>
+          <w:p>
+            <w:pPr>
+              <w:spacing w:after="0"/>
+            </w:pPr>
+            <w:r/>
+            <w:r>
+              <w:rPr>
+                <w:rFonts w:ascii="Calibri" w:hAnsi="Calibri" w:eastAsia="Calibri"/>
+                <w:b w:val="0"/>
+                <w:color w:val="2B3440"/>
+                <w:sz w:val="18"/>
+              </w:rPr>
               <w:t>Nooelec FlyCatcher ADS-B side; application-owned readsb</w:t>
             </w:r>
           </w:p>
@@ -2154,7 +2307,7 @@
         <w:tc>
           <w:tcPr>
             <w:tcW w:type="dxa" w:w="1944"/>
-            <w:shd w:fill="FFFFFF"/>
+            <w:shd w:fill="E8EEF5"/>
             <w:vAlign w:val="center"/>
             <w:tcMar>
               <w:top w:w="80" w:type="dxa"/>
@@ -2184,7 +2337,7 @@
         <w:tc>
           <w:tcPr>
             <w:tcW w:type="dxa" w:w="1944"/>
-            <w:shd w:fill="E8EEF5"/>
+            <w:shd w:fill="FFFFFF"/>
             <w:vAlign w:val="center"/>
             <w:tcMar>
               <w:top w:w="80" w:type="dxa"/>
@@ -2212,7 +2365,7 @@
         <w:tc>
           <w:tcPr>
             <w:tcW w:type="dxa" w:w="5472"/>
-            <w:shd w:fill="E8EEF5"/>
+            <w:shd w:fill="FFFFFF"/>
             <w:vAlign w:val="center"/>
             <w:tcMar>
               <w:top w:w="80" w:type="dxa"/>
@@ -2240,7 +2393,7 @@
         <w:tc>
           <w:tcPr>
             <w:tcW w:type="dxa" w:w="1944"/>
-            <w:shd w:fill="E8EEF5"/>
+            <w:shd w:fill="FFFFFF"/>
             <w:vAlign w:val="center"/>
             <w:tcMar>
               <w:top w:w="80" w:type="dxa"/>
@@ -2333,7 +2486,16 @@
         <w:spacing w:after="60"/>
       </w:pPr>
       <w:r>
-        <w:t>The VHF antenna belongs on the Nano2+ assigned 00000162.</w:t>
+        <w:t>The NOAA VHF antenna belongs on the Nano2+ assigned 00000162.</w:t>
+      </w:r>
+    </w:p>
+    <w:p>
+      <w:pPr>
+        <w:pStyle w:val="ListBullet"/>
+        <w:spacing w:after="60"/>
+      </w:pPr>
+      <w:r>
+        <w:t>The civil Airband antenna belongs on the dedicated receiver assigned 00000118.</w:t>
       </w:r>
     </w:p>
     <w:p>
@@ -2360,7 +2522,7 @@
         <w:spacing w:after="60"/>
       </w:pPr>
       <w:r>
-        <w:t>NOAA and Airband share 00000162 and cannot own that receiver simultaneously.</w:t>
+        <w:t>NOAA and Airband have dedicated receivers: 00000162 and 00000118.</w:t>
       </w:r>
     </w:p>
     <w:p>
@@ -2464,7 +2626,7 @@
         <w:spacing w:after="60"/>
       </w:pPr>
       <w:r>
-        <w:t>Confirm receiver_roles identify 00000162, 00001090, and 00000978 as configured.</w:t>
+        <w:t>Confirm receiver_roles identify 00000162, 00000118, 00001090, and 00000978 as configured.</w:t>
       </w:r>
     </w:p>
     <w:p>
@@ -2661,7 +2823,7 @@
         <w:spacing w:after="60"/>
       </w:pPr>
       <w:r>
-        <w:t>Stop NOAA before starting civil Airband, because both share receiver 00000162.</w:t>
+        <w:t>Stop any active NOAA listening session before starting civil Airband; Airband uses dedicated receiver 00000118.</w:t>
       </w:r>
     </w:p>
     <w:p>
@@ -3806,7 +3968,7 @@
                 <w:color w:val="2B3440"/>
                 <w:sz w:val="18"/>
               </w:rPr>
-              <w:t>Confirm VHF antenna and serial 00000162; inspect USB claim errors.</w:t>
+              <w:t>Confirm NOAA VHF antenna and serial 00000162; inspect USB claim errors.</w:t>
             </w:r>
           </w:p>
         </w:tc>
@@ -4049,7 +4211,7 @@
         <w:spacing w:after="60"/>
       </w:pPr>
       <w:r>
-        <w:t>NOAA/Airband ownership is 00000162 and only one VHF audio mode is active at a time.</w:t>
+        <w:t>NOAA owns 00000162 and civil Airband owns dedicated receiver 00000118.</w:t>
       </w:r>
     </w:p>
     <w:p>

</xml_diff>